<commit_message>
feat(brandbook): light airy typography, minimal letterheads, clean email signatures, fixed stamp geometry
</commit_message>
<xml_diff>
--- a/site/assets/fero_letterhead_bw.docx
+++ b/site/assets/fero_letterhead_bw.docx
@@ -2,184 +2,56 @@
 <file path=word/document.xml><?xml version="1.0" encoding="utf-8"?>
 <w:document xmlns:wpc="http://schemas.microsoft.com/office/word/2010/wordprocessingCanvas" xmlns:mo="http://schemas.microsoft.com/office/mac/office/2008/main" xmlns:mc="http://schemas.openxmlformats.org/markup-compatibility/2006" xmlns:mv="urn:schemas-microsoft-com:mac:vml" xmlns:o="urn:schemas-microsoft-com:office:office" xmlns:r="http://schemas.openxmlformats.org/officeDocument/2006/relationships" xmlns:m="http://schemas.openxmlformats.org/officeDocument/2006/math" xmlns:v="urn:schemas-microsoft-com:vml" xmlns:wp14="http://schemas.microsoft.com/office/word/2010/wordprocessingDrawing" xmlns:wp="http://schemas.openxmlformats.org/drawingml/2006/wordprocessingDrawing" xmlns:w10="urn:schemas-microsoft-com:office:word" xmlns:w="http://schemas.openxmlformats.org/wordprocessingml/2006/main" xmlns:w14="http://schemas.microsoft.com/office/word/2010/wordml" xmlns:wpg="http://schemas.microsoft.com/office/word/2010/wordprocessingGroup" xmlns:wpi="http://schemas.microsoft.com/office/word/2010/wordprocessingInk" xmlns:wne="http://schemas.microsoft.com/office/word/2006/wordml" xmlns:wps="http://schemas.microsoft.com/office/word/2010/wordprocessingShape" mc:Ignorable="w14 wp14">
   <w:body>
-    <w:tbl>
-      <w:tblPr>
-        <w:tblW w:type="auto" w:w="0"/>
-        <w:jc w:val="center"/>
-        <w:tblLayout w:type="fixed"/>
-        <w:tblLook w:firstColumn="1" w:firstRow="1" w:lastColumn="0" w:lastRow="0" w:noHBand="0" w:noVBand="1" w:val="04A0"/>
-      </w:tblPr>
-      <w:tblGrid>
-        <w:gridCol w:w="5953"/>
-        <w:gridCol w:w="3969"/>
-      </w:tblGrid>
-      <w:tr>
-        <w:tc>
-          <w:tcPr>
-            <w:tcW w:type="dxa" w:w="4961"/>
-          </w:tcPr>
-          <w:p>
-            <w:pPr>
-              <w:spacing w:after="40"/>
-            </w:pPr>
-            <w:r>
-              <w:drawing>
-                <wp:inline xmlns:a="http://schemas.openxmlformats.org/drawingml/2006/main" xmlns:pic="http://schemas.openxmlformats.org/drawingml/2006/picture">
-                  <wp:extent cx="1620000" cy="397477"/>
-                  <wp:docPr id="1" name="Picture 1"/>
-                  <wp:cNvGraphicFramePr>
-                    <a:graphicFrameLocks noChangeAspect="1"/>
-                  </wp:cNvGraphicFramePr>
-                  <a:graphic>
-                    <a:graphicData uri="http://schemas.openxmlformats.org/drawingml/2006/picture">
-                      <pic:pic>
-                        <pic:nvPicPr>
-                          <pic:cNvPr id="0" name="fero_logo_contour.png"/>
-                          <pic:cNvPicPr/>
-                        </pic:nvPicPr>
-                        <pic:blipFill>
-                          <a:blip r:embed="rId9"/>
-                          <a:stretch>
-                            <a:fillRect/>
-                          </a:stretch>
-                        </pic:blipFill>
-                        <pic:spPr>
-                          <a:xfrm>
-                            <a:off x="0" y="0"/>
-                            <a:ext cx="1620000" cy="397477"/>
-                          </a:xfrm>
-                          <a:prstGeom prst="rect"/>
-                        </pic:spPr>
-                      </pic:pic>
-                    </a:graphicData>
-                  </a:graphic>
-                </wp:inline>
-              </w:drawing>
-            </w:r>
-          </w:p>
-          <w:p>
-            <w:pPr>
-              <w:spacing w:before="60" w:after="0"/>
-            </w:pPr>
-            <w:r>
-              <w:rPr>
-                <w:rFonts w:ascii="Arial" w:hAnsi="Arial"/>
-                <w:b/>
-                <w:color w:val="111111"/>
-                <w:sz w:val="15"/>
-              </w:rPr>
-              <w:t>ПРОЕКТИРОВАНИЕ  /  РАСЧЁТЫ  /  ЭКСПЕРТИЗА</w:t>
-            </w:r>
-          </w:p>
-        </w:tc>
-        <w:tc>
-          <w:tcPr>
-            <w:tcW w:type="dxa" w:w="4961"/>
-          </w:tcPr>
-          <w:p>
-            <w:pPr>
-              <w:spacing w:after="0"/>
-              <w:jc w:val="right"/>
-            </w:pPr>
-            <w:r>
-              <w:rPr>
-                <w:rFonts w:ascii="Arial" w:hAnsi="Arial"/>
-                <w:b/>
-                <w:color w:val="111111"/>
-                <w:sz w:val="17"/>
-              </w:rPr>
-              <w:t>ООО «ФЕРО»</w:t>
-            </w:r>
-          </w:p>
-          <w:p>
-            <w:pPr>
-              <w:spacing w:after="0" w:before="20"/>
-              <w:jc w:val="right"/>
-            </w:pPr>
-            <w:r>
-              <w:rPr>
-                <w:rFonts w:ascii="Arial" w:hAnsi="Arial"/>
-                <w:b w:val="0"/>
-                <w:color w:val="505050"/>
-                <w:sz w:val="14"/>
-              </w:rPr>
-              <w:t>ИНН 7810789012 / КПП 781001001</w:t>
-            </w:r>
-          </w:p>
-          <w:p>
-            <w:pPr>
-              <w:spacing w:after="0" w:before="20"/>
-              <w:jc w:val="right"/>
-            </w:pPr>
-            <w:r>
-              <w:rPr>
-                <w:rFonts w:ascii="Arial" w:hAnsi="Arial"/>
-                <w:b w:val="0"/>
-                <w:color w:val="505050"/>
-                <w:sz w:val="14"/>
-              </w:rPr>
-              <w:t>г. Санкт-Петербург, Московский пр., 140</w:t>
-            </w:r>
-          </w:p>
-          <w:p>
-            <w:pPr>
-              <w:spacing w:after="0" w:before="20"/>
-              <w:jc w:val="right"/>
-            </w:pPr>
-            <w:r>
-              <w:rPr>
-                <w:rFonts w:ascii="Arial" w:hAnsi="Arial"/>
-                <w:b w:val="0"/>
-                <w:color w:val="505050"/>
-                <w:sz w:val="14"/>
-              </w:rPr>
-              <w:t>+7 (812) 385-00-55 • info@ferospb.ru</w:t>
-            </w:r>
-          </w:p>
-          <w:p>
-            <w:pPr>
-              <w:spacing w:after="0" w:before="20"/>
-              <w:jc w:val="right"/>
-            </w:pPr>
-            <w:r>
-              <w:rPr>
-                <w:rFonts w:ascii="Arial" w:hAnsi="Arial"/>
-                <w:b/>
-                <w:color w:val="111111"/>
-                <w:sz w:val="14"/>
-              </w:rPr>
-              <w:t>www.ferospb.info  •  www.ferospb.ru</w:t>
-            </w:r>
-          </w:p>
-        </w:tc>
-      </w:tr>
-    </w:tbl>
     <w:p>
       <w:pPr>
-        <w:spacing w:before="120" w:after="120"/>
-        <w:pBdr>
-          <w:bottom w:val="single" w:sz="6" w:space="1" w:color="111111"/>
-        </w:pBdr>
+        <w:spacing w:before="0" w:after="400"/>
       </w:pPr>
+      <w:r>
+        <w:drawing>
+          <wp:inline xmlns:a="http://schemas.openxmlformats.org/drawingml/2006/main" xmlns:pic="http://schemas.openxmlformats.org/drawingml/2006/picture">
+            <wp:extent cx="1728000" cy="423975"/>
+            <wp:docPr id="1" name="Picture 1"/>
+            <wp:cNvGraphicFramePr>
+              <a:graphicFrameLocks noChangeAspect="1"/>
+            </wp:cNvGraphicFramePr>
+            <a:graphic>
+              <a:graphicData uri="http://schemas.openxmlformats.org/drawingml/2006/picture">
+                <pic:pic>
+                  <pic:nvPicPr>
+                    <pic:cNvPr id="0" name="fero_logo_contour.png"/>
+                    <pic:cNvPicPr/>
+                  </pic:nvPicPr>
+                  <pic:blipFill>
+                    <a:blip r:embed="rId9"/>
+                    <a:stretch>
+                      <a:fillRect/>
+                    </a:stretch>
+                  </pic:blipFill>
+                  <pic:spPr>
+                    <a:xfrm>
+                      <a:off x="0" y="0"/>
+                      <a:ext cx="1728000" cy="423975"/>
+                    </a:xfrm>
+                    <a:prstGeom prst="rect"/>
+                  </pic:spPr>
+                </pic:pic>
+              </a:graphicData>
+            </a:graphic>
+          </wp:inline>
+        </w:drawing>
+      </w:r>
     </w:p>
     <w:p>
       <w:pPr>
-        <w:spacing w:before="40" w:after="280"/>
+        <w:spacing w:before="0" w:after="560"/>
       </w:pPr>
       <w:r>
         <w:rPr>
           <w:rFonts w:ascii="Arial" w:hAnsi="Arial"/>
-          <w:color w:val="505050"/>
+          <w:color w:val="64748B"/>
           <w:sz w:val="17"/>
         </w:rPr>
         <w:t>Исх. № ____________ от «____» ____________ 2026 г.</w:t>
-      </w:r>
-      <w:r>
-        <w:rPr>
-          <w:rFonts w:ascii="Arial" w:hAnsi="Arial"/>
-          <w:color w:val="505050"/>
-          <w:sz w:val="17"/>
-        </w:rPr>
         <w:tab/>
         <w:tab/>
         <w:tab/>
@@ -189,67 +61,66 @@
     </w:p>
     <w:p>
       <w:pPr>
-        <w:spacing w:before="200" w:after="240"/>
-        <w:jc w:val="left"/>
+        <w:spacing w:before="160" w:after="280"/>
       </w:pPr>
       <w:r>
         <w:rPr>
           <w:rFonts w:ascii="Arial" w:hAnsi="Arial"/>
           <w:b/>
-          <w:color w:val="111111"/>
-          <w:sz w:val="24"/>
+          <w:color w:val="0F172A"/>
+          <w:sz w:val="23"/>
         </w:rPr>
-        <w:t>СЛУЖЕБНАЯ ЗАПИСКА / ОФИЦИАЛЬНОЕ УВЕДОМЛЕНИЕ</w:t>
+        <w:t>СЛУЖЕБНАЯ ЗАПИСКА / ТЕХНИЧЕСКИЙ АКТ</w:t>
       </w:r>
     </w:p>
     <w:p>
       <w:pPr>
-        <w:spacing w:after="120" w:line="288" w:lineRule="auto"/>
+        <w:spacing w:after="160" w:line="300" w:lineRule="auto"/>
       </w:pPr>
       <w:r>
         <w:rPr>
           <w:rFonts w:ascii="Arial" w:hAnsi="Arial"/>
-          <w:color w:val="111111"/>
+          <w:color w:val="0F172A"/>
           <w:sz w:val="19"/>
         </w:rPr>
-        <w:t>Настоящим инженерное бюро «ФЕРО» подтверждает готовность выполнения комплекса работ по проектированию и математическому моделированию фасадных оболочек на объекте капитального строительства.</w:t>
+        <w:t>Настоящим инженерное бюро «ФЕРО» подтверждает готовность выполнения комплекса научно-исследовательских, расчетных и проектных работ по разработке светопрозрачных фасадных оболочек, навесных вентилируемых систем и нестандартных архитектурных конструкций на объекте капитального строительства.</w:t>
       </w:r>
     </w:p>
     <w:p>
       <w:pPr>
-        <w:spacing w:after="120" w:line="288" w:lineRule="auto"/>
+        <w:spacing w:after="160" w:line="300" w:lineRule="auto"/>
       </w:pPr>
       <w:r>
         <w:rPr>
           <w:rFonts w:ascii="Arial" w:hAnsi="Arial"/>
-          <w:color w:val="111111"/>
+          <w:color w:val="0F172A"/>
           <w:sz w:val="19"/>
         </w:rPr>
-        <w:t>В состав инжинирингового пакета входят статические и динамические аэродинамические расчеты, оптимизация раскладки светопрозрачных и навесных систем, детальная проработка узлов примыканий и подготовка рабочей документации стадии РД в полном соответствии со стандартами СПДС и ГОСТ.</w:t>
+        <w:t>Команда специалистов бюро обеспечивает математическое моделирование ветровых потоков, статический расчет несущих профилей и крепежных кронштейнов, теплотехнические расчеты узлов примыканий и выпуск полного комплекта рабочей документации (РД/КД) в строгом соответствии со стандартами СПДС и ГОСТ.</w:t>
       </w:r>
     </w:p>
     <w:p>
       <w:pPr>
-        <w:spacing w:after="120" w:line="288" w:lineRule="auto"/>
+        <w:spacing w:after="160" w:line="300" w:lineRule="auto"/>
       </w:pPr>
       <w:r>
         <w:rPr>
           <w:rFonts w:ascii="Arial" w:hAnsi="Arial"/>
-          <w:color w:val="111111"/>
+          <w:color w:val="0F172A"/>
           <w:sz w:val="19"/>
         </w:rPr>
-        <w:t>Срок выполнения проектных и расчетных работ согласовывается в соответствии с утвержденным техническим заданием и графиком производства.</w:t>
+        <w:t>Сроки выполнения проектных и расчетных работ определяются утвержденным техническим заданием и календарным планом реализации проекта.</w:t>
       </w:r>
     </w:p>
     <w:p>
       <w:pPr>
-        <w:spacing w:before="560" w:after="0"/>
+        <w:spacing w:before="720" w:after="0"/>
       </w:pPr>
       <w:r>
         <w:rPr>
           <w:rFonts w:ascii="Arial" w:hAnsi="Arial"/>
           <w:b/>
-          <w:color w:val="111111"/>
+          <w:color w:val="0F172A"/>
           <w:sz w:val="19"/>
         </w:rPr>
         <w:t>Генеральный директор ООО «ФЕРО»</w:t>
@@ -262,13 +133,46 @@
       </w:r>
     </w:p>
     <w:sectPr>
+      <w:footerReference w:type="default" r:id="rId10"/>
       <w:pgSz w:w="11906" w:h="16838"/>
-      <w:pgMar w:top="850" w:right="850" w:bottom="850" w:left="1134" w:header="720" w:footer="720" w:gutter="0"/>
+      <w:pgMar w:top="1134" w:right="850" w:bottom="1020" w:left="1134" w:header="720" w:footer="720" w:gutter="0"/>
       <w:cols w:space="720"/>
       <w:docGrid w:linePitch="360"/>
     </w:sectPr>
   </w:body>
 </w:document>
+</file>
+
+<file path=word/footer1.xml><?xml version="1.0" encoding="utf-8"?>
+<w:ftr xmlns:m="http://schemas.openxmlformats.org/officeDocument/2006/math" xmlns:mc="http://schemas.openxmlformats.org/markup-compatibility/2006" xmlns:mo="http://schemas.microsoft.com/office/mac/office/2008/main" xmlns:mv="urn:schemas-microsoft-com:mac:vml" xmlns:o="urn:schemas-microsoft-com:office:office" xmlns:r="http://schemas.openxmlformats.org/officeDocument/2006/relationships" xmlns:v="urn:schemas-microsoft-com:vml" xmlns:w10="urn:schemas-microsoft-com:office:word" xmlns:w14="http://schemas.microsoft.com/office/word/2010/wordml" xmlns:w="http://schemas.openxmlformats.org/wordprocessingml/2006/main" xmlns:wne="http://schemas.microsoft.com/office/word/2006/wordml" xmlns:wp14="http://schemas.microsoft.com/office/word/2010/wordprocessingDrawing" xmlns:wp="http://schemas.openxmlformats.org/drawingml/2006/wordprocessingDrawing" xmlns:wpc="http://schemas.microsoft.com/office/word/2010/wordprocessingCanvas" xmlns:wpg="http://schemas.microsoft.com/office/word/2010/wordprocessingGroup" xmlns:wpi="http://schemas.microsoft.com/office/word/2010/wordprocessingInk" xmlns:wps="http://schemas.microsoft.com/office/word/2010/wordprocessingShape" mc:Ignorable="w14 wp14">
+  <w:p>
+    <w:pPr>
+      <w:pStyle w:val="Footer"/>
+      <w:spacing w:before="0" w:after="40"/>
+      <w:jc w:val="center"/>
+      <w:pBdr>
+        <w:top w:val="single" w:sz="6" w:space="4" w:color="111111"/>
+      </w:pBdr>
+    </w:pPr>
+    <w:r>
+      <w:rPr>
+        <w:rFonts w:ascii="Arial" w:hAnsi="Arial"/>
+        <w:color w:val="64748B"/>
+        <w:sz w:val="15"/>
+      </w:rPr>
+      <w:t>ООО «ФЕРО» • 198035, Россия, г. Санкт-Петербург, ул. Невельская, д. 18, лит. А, пом. 46</w:t>
+      <w:br/>
+    </w:r>
+    <w:r>
+      <w:rPr>
+        <w:rFonts w:ascii="Arial" w:hAnsi="Arial"/>
+        <w:color w:val="64748B"/>
+        <w:sz w:val="15"/>
+      </w:rPr>
+      <w:t>Тел.: +7 (812) 603-21-11 • info@ferospb.ru • www.ferospb.ru • www.ferospb.info</w:t>
+    </w:r>
+  </w:p>
+</w:ftr>
 </file>
 
 <file path=word/numbering.xml><?xml version="1.0" encoding="utf-8"?>

</xml_diff>